<commit_message>
20261021 - Back-up of first round of updates
</commit_message>
<xml_diff>
--- a/supplement.docx
+++ b/supplement.docx
@@ -5381,13 +5381,127 @@
         <w:t xml:space="preserve"> </w:t>
       </w:r>
       <w:r>
-        <w:t xml:space="preserve">events is estimated as $</w:t>
-      </w:r>
-      <w:r>
-        <w:t xml:space="preserve"> </w:t>
-      </w:r>
-      <w:r>
-        <w:t xml:space="preserve">$, where the denominator is the risk-weighted number at risk. This risk-weighted number at risk is the implicit sample size used for the baseline hazard estimation and based on</w:t>
+        <w:t xml:space="preserve">events is estimated as</w:t>
+      </w:r>
+      <w:r>
+        <w:t xml:space="preserve"> </w:t>
+      </w:r>
+      <m:oMath>
+        <m:f>
+          <m:fPr>
+            <m:type m:val="bar"/>
+          </m:fPr>
+          <m:num>
+            <m:sSub>
+              <m:e>
+                <m:r>
+                  <m:t>d</m:t>
+                </m:r>
+              </m:e>
+              <m:sub>
+                <m:r>
+                  <m:t>j</m:t>
+                </m:r>
+              </m:sub>
+            </m:sSub>
+          </m:num>
+          <m:den>
+            <m:nary>
+              <m:naryPr>
+                <m:chr m:val="∑"/>
+                <m:limLoc m:val="undOvr"/>
+                <m:subHide m:val="off"/>
+                <m:supHide m:val="on"/>
+              </m:naryPr>
+              <m:sub>
+                <m:r>
+                  <m:t>i</m:t>
+                </m:r>
+                <m:r>
+                  <m:rPr>
+                    <m:sty m:val="p"/>
+                  </m:rPr>
+                  <m:t>∈</m:t>
+                </m:r>
+                <m:sSub>
+                  <m:e>
+                    <m:r>
+                      <m:t>R</m:t>
+                    </m:r>
+                  </m:e>
+                  <m:sub>
+                    <m:r>
+                      <m:t>j</m:t>
+                    </m:r>
+                  </m:sub>
+                </m:sSub>
+              </m:sub>
+              <m:sup>
+                <m:r>
+                  <m:t>​</m:t>
+                </m:r>
+              </m:sup>
+              <m:e>
+                <m:r>
+                  <m:rPr>
+                    <m:sty m:val="p"/>
+                  </m:rPr>
+                  <m:t>exp</m:t>
+                </m:r>
+              </m:e>
+            </m:nary>
+            <m:d>
+              <m:dPr>
+                <m:begChr m:val="("/>
+                <m:sepChr m:val=""/>
+                <m:endChr m:val=")"/>
+                <m:grow/>
+              </m:dPr>
+              <m:e>
+                <m:sSup>
+                  <m:e>
+                    <m:acc>
+                      <m:accPr>
+                        <m:chr m:val="̂"/>
+                      </m:accPr>
+                      <m:e>
+                        <m:r>
+                          <m:t>β</m:t>
+                        </m:r>
+                      </m:e>
+                    </m:acc>
+                  </m:e>
+                  <m:sup>
+                    <m:r>
+                      <m:rPr>
+                        <m:sty m:val="p"/>
+                      </m:rPr>
+                      <m:t>⊤</m:t>
+                    </m:r>
+                  </m:sup>
+                </m:sSup>
+                <m:sSub>
+                  <m:e>
+                    <m:r>
+                      <m:rPr>
+                        <m:sty m:val="b"/>
+                      </m:rPr>
+                      <m:t>x</m:t>
+                    </m:r>
+                  </m:e>
+                  <m:sub>
+                    <m:r>
+                      <m:t>i</m:t>
+                    </m:r>
+                  </m:sub>
+                </m:sSub>
+              </m:e>
+            </m:d>
+          </m:den>
+        </m:f>
+      </m:oMath>
+      <w:r>
+        <w:t xml:space="preserve">, where the denominator is the risk-weighted number at risk. This risk-weighted number at risk is the implicit sample size used for the baseline hazard estimation and based on</w:t>
       </w:r>
       <w:r>
         <w:t xml:space="preserve"> </w:t>
@@ -9753,7 +9867,7 @@
         <w:pStyle w:val="FirstParagraph"/>
       </w:pPr>
       <w:r>
-        <w:t xml:space="preserve">So we see that the mean linear predictor (X</w:t>
+        <w:t xml:space="preserve">So we observe that the mean linear predictor (X</w:t>
       </w:r>
       <w:r>
         <w:t xml:space="preserve">) is 0 (ignoring some monte-carlo standard error), while the mean hazard ratio is 1.27.</w:t>

</xml_diff>